<commit_message>
Almost done README,  Updated reports, and added  images
</commit_message>
<xml_diff>
--- a/Reports/Final Report First Draft - Snow Munchers.docx
+++ b/Reports/Final Report First Draft - Snow Munchers.docx
@@ -232,7 +232,7 @@
           </mc:Choice>
           <mc:Fallback>
             <w:pict>
-              <v:shapetype w14:anchorId="6A6EA59D" id="_x0000_t32" coordsize="21600,21600" o:spt="32" o:oned="t" path="m,l21600,21600e" filled="f">
+              <v:shapetype w14:anchorId="3FA4C2AD" id="_x0000_t32" coordsize="21600,21600" o:spt="32" o:oned="t" path="m,l21600,21600e" filled="f">
                 <v:path arrowok="t" fillok="f" o:connecttype="none"/>
                 <o:lock v:ext="edit" shapetype="t"/>
               </v:shapetype>
@@ -281,16 +281,8 @@
         <w:rPr>
           <w:color w:val="000000" w:themeColor="text1"/>
         </w:rPr>
-        <w:t xml:space="preserve">The Snow Munchers &amp; </w:t>
-      </w:r>
-      <w:proofErr w:type="spellStart"/>
-      <w:r>
-        <w:rPr>
-          <w:color w:val="000000" w:themeColor="text1"/>
-        </w:rPr>
-        <w:t>GoBabyGo</w:t>
-      </w:r>
-      <w:proofErr w:type="spellEnd"/>
+        <w:t>The Snow Munchers &amp; GoBabyGo</w:t>
+      </w:r>
     </w:p>
     <w:p>
       <w:pPr>
@@ -332,7 +324,6 @@
           <w:szCs w:val="28"/>
           <w:u w:val="single"/>
         </w:rPr>
-        <w:lastRenderedPageBreak/>
         <w:t>Table of</w:t>
       </w:r>
       <w:r>
@@ -1233,21 +1224,7 @@
         <w:rPr>
           <w:color w:val="000000" w:themeColor="text1"/>
         </w:rPr>
-        <w:t>“</w:t>
-      </w:r>
-      <w:proofErr w:type="spellStart"/>
-      <w:r>
-        <w:rPr>
-          <w:color w:val="000000" w:themeColor="text1"/>
-        </w:rPr>
-        <w:t>GoBabyGo</w:t>
-      </w:r>
-      <w:proofErr w:type="spellEnd"/>
-      <w:r>
-        <w:rPr>
-          <w:color w:val="000000" w:themeColor="text1"/>
-        </w:rPr>
-        <w:t xml:space="preserve">” is a non-profit organization dedicated to </w:t>
+        <w:t xml:space="preserve">“GoBabyGo” is a non-profit organization dedicated to </w:t>
       </w:r>
       <w:r>
         <w:rPr>
@@ -1271,21 +1248,7 @@
         <w:rPr>
           <w:color w:val="000000" w:themeColor="text1"/>
         </w:rPr>
-        <w:t xml:space="preserve"> cars. Many children with mobility challenges struggle to press the pedal and steer simultaneously, making it difficult to operate the vehicle without constant assistance. Typical “</w:t>
-      </w:r>
-      <w:proofErr w:type="spellStart"/>
-      <w:r>
-        <w:rPr>
-          <w:color w:val="000000" w:themeColor="text1"/>
-        </w:rPr>
-        <w:t>GoBabyGo</w:t>
-      </w:r>
-      <w:proofErr w:type="spellEnd"/>
-      <w:r>
-        <w:rPr>
-          <w:color w:val="000000" w:themeColor="text1"/>
-        </w:rPr>
-        <w:t>” modifications reroute the pedal wiring to a button mounted on the steering wheel, simplifying acceleration and improving usability.</w:t>
+        <w:t xml:space="preserve"> cars. Many children with mobility challenges struggle to press the pedal and steer simultaneously, making it difficult to operate the vehicle without constant assistance. Typical “GoBabyGo” modifications reroute the pedal wiring to a button mounted on the steering wheel, simplifying acceleration and improving usability.</w:t>
       </w:r>
     </w:p>
     <w:p>
@@ -1518,21 +1481,7 @@
         <w:rPr>
           <w:color w:val="000000" w:themeColor="text1"/>
         </w:rPr>
-        <w:t>This paper documents the redesign of a motorized toy car by adapting the controls to run via a joystick for the program “</w:t>
-      </w:r>
-      <w:proofErr w:type="spellStart"/>
-      <w:r>
-        <w:rPr>
-          <w:color w:val="000000" w:themeColor="text1"/>
-        </w:rPr>
-        <w:t>GoBabyGo</w:t>
-      </w:r>
-      <w:proofErr w:type="spellEnd"/>
-      <w:r>
-        <w:rPr>
-          <w:color w:val="000000" w:themeColor="text1"/>
-        </w:rPr>
-        <w:t>!”. They are an organization at Colorado Mesa University that aims to aid in the issue of children</w:t>
+        <w:t>This paper documents the redesign of a motorized toy car by adapting the controls to run via a joystick for the program “GoBabyGo!”. They are an organization at Colorado Mesa University that aims to aid in the issue of children</w:t>
       </w:r>
       <w:r>
         <w:rPr>
@@ -1556,35 +1505,7 @@
         <w:rPr>
           <w:color w:val="000000" w:themeColor="text1"/>
         </w:rPr>
-        <w:t>not being able to utilize normal motorized kid cars. This idea of adapting a joystick controller is founded on the original “</w:t>
-      </w:r>
-      <w:proofErr w:type="spellStart"/>
-      <w:r>
-        <w:rPr>
-          <w:color w:val="000000" w:themeColor="text1"/>
-        </w:rPr>
-        <w:t>GoBabyGo</w:t>
-      </w:r>
-      <w:proofErr w:type="spellEnd"/>
-      <w:r>
-        <w:rPr>
-          <w:color w:val="000000" w:themeColor="text1"/>
-        </w:rPr>
-        <w:t>!” adaptation of replacing the traditional “gas” pedal with a switch-powered button located on the steering wheel [1]. The issue with this different access for independent mobility is that there are children with limited mobility in the sense that they cannot maneuver the traditional steering wheel while simultaneously pressing the button to move the car. With this realization, Dr. Santos, the head of “</w:t>
-      </w:r>
-      <w:proofErr w:type="spellStart"/>
-      <w:r>
-        <w:rPr>
-          <w:color w:val="000000" w:themeColor="text1"/>
-        </w:rPr>
-        <w:t>GoBabyGo</w:t>
-      </w:r>
-      <w:proofErr w:type="spellEnd"/>
-      <w:r>
-        <w:rPr>
-          <w:color w:val="000000" w:themeColor="text1"/>
-        </w:rPr>
-        <w:t>!” tasked the Snow Munchers, with the development of this joystick controller to access the “go” motion and steering all in one component. This makes the operation of the car more intuitive and user friendly for the client.</w:t>
+        <w:t>not being able to utilize normal motorized kid cars. This idea of adapting a joystick controller is founded on the original “GoBabyGo!” adaptation of replacing the traditional “gas” pedal with a switch-powered button located on the steering wheel [1]. The issue with this different access for independent mobility is that there are children with limited mobility in the sense that they cannot maneuver the traditional steering wheel while simultaneously pressing the button to move the car. With this realization, Dr. Santos, the head of “GoBabyGo!” tasked the Snow Munchers, with the development of this joystick controller to access the “go” motion and steering all in one component. This makes the operation of the car more intuitive and user friendly for the client.</w:t>
       </w:r>
     </w:p>
     <w:p>
@@ -1649,21 +1570,7 @@
         <w:rPr>
           <w:color w:val="000000" w:themeColor="text1"/>
         </w:rPr>
-        <w:t>“</w:t>
-      </w:r>
-      <w:proofErr w:type="spellStart"/>
-      <w:r>
-        <w:rPr>
-          <w:color w:val="000000" w:themeColor="text1"/>
-        </w:rPr>
-        <w:t>GoBabyGo</w:t>
-      </w:r>
-      <w:proofErr w:type="spellEnd"/>
-      <w:r>
-        <w:rPr>
-          <w:color w:val="000000" w:themeColor="text1"/>
-        </w:rPr>
-        <w:t>!” is a charitable program that takes ride-</w:t>
+        <w:t>“GoBabyGo!” is a charitable program that takes ride-</w:t>
       </w:r>
       <w:r>
         <w:rPr>
@@ -1762,28 +1669,7 @@
         <w:rPr>
           <w:color w:val="000000" w:themeColor="text1"/>
         </w:rPr>
-        <w:t xml:space="preserve">) which controls the steering and go through a microcontroller and other complicated </w:t>
-      </w:r>
-      <w:r>
-        <w:rPr>
-          <w:color w:val="000000" w:themeColor="text1"/>
-        </w:rPr>
-        <w:lastRenderedPageBreak/>
-        <w:t xml:space="preserve">electronics. [3] The issue with designs like these is that they are costly and more complicated as a microcontroller needs coding and </w:t>
-      </w:r>
-      <w:proofErr w:type="gramStart"/>
-      <w:r>
-        <w:rPr>
-          <w:color w:val="000000" w:themeColor="text1"/>
-        </w:rPr>
-        <w:t>complicates</w:t>
-      </w:r>
-      <w:proofErr w:type="gramEnd"/>
-      <w:r>
-        <w:rPr>
-          <w:color w:val="000000" w:themeColor="text1"/>
-        </w:rPr>
-        <w:t xml:space="preserve"> the system. The Snow Munchers design avoids replacing the control unit in the car by removing the old input methods, steering wheel and gas pedal, and diverting the wires to the joystick then through a circuit which connects to H-bridge motor controllers to control the forward, backward, and steering motors. This allows us to cut out buying a new control unit or coding a microcontroller. This cuts down on complexity and cost immensely. This is reflected by the fact that past designs like the </w:t>
+        <w:t xml:space="preserve">) which controls the steering and go through a microcontroller and other complicated electronics. [3] The issue with designs like these is that they are costly and more complicated as a microcontroller needs coding and complicates the system. The Snow Munchers design avoids replacing the control unit in the car by removing the old input methods, steering wheel and gas pedal, and diverting the wires to the joystick then through a circuit which connects to H-bridge motor controllers to control the forward, backward, and steering motors. This allows us to cut out buying a new control unit or coding a microcontroller. This cuts down on complexity and cost immensely. This is reflected by the fact that past designs like the </w:t>
       </w:r>
       <w:r>
         <w:rPr>
@@ -1871,14 +1757,12 @@
         </w:rPr>
         <w:t xml:space="preserve">The project deliverable is an optimized </w:t>
       </w:r>
-      <w:proofErr w:type="gramStart"/>
       <w:r>
         <w:rPr>
           <w:color w:val="000000" w:themeColor="text1"/>
         </w:rPr>
         <w:t>joystick controlled</w:t>
       </w:r>
-      <w:proofErr w:type="gramEnd"/>
       <w:r>
         <w:rPr>
           <w:color w:val="000000" w:themeColor="text1"/>
@@ -2094,21 +1978,7 @@
         <w:rPr>
           <w:color w:val="000000" w:themeColor="text1"/>
         </w:rPr>
-        <w:t xml:space="preserve">Requirement: Must not exceed 113° over </w:t>
-      </w:r>
-      <w:proofErr w:type="gramStart"/>
-      <w:r>
-        <w:rPr>
-          <w:color w:val="000000" w:themeColor="text1"/>
-        </w:rPr>
-        <w:t>15 minute</w:t>
-      </w:r>
-      <w:proofErr w:type="gramEnd"/>
-      <w:r>
-        <w:rPr>
-          <w:color w:val="000000" w:themeColor="text1"/>
-        </w:rPr>
-        <w:t xml:space="preserve"> time intervals.  </w:t>
+        <w:t xml:space="preserve">Requirement: Must not exceed 113° over 15 minute time intervals.  </w:t>
       </w:r>
     </w:p>
     <w:p>
@@ -2181,28 +2051,7 @@
         <w:rPr>
           <w:color w:val="000000" w:themeColor="text1"/>
         </w:rPr>
-        <w:t xml:space="preserve">The joy-stick integrated kid car is a redesign of traditional steering and throttle controls. The functioning portion of this new joystick is implemented into the car’s original wiring circuit using a H-Bridge DC Motor Controller. For each positive or negative x and y direction, the joystick assigns all four switches to one specific direction. With each input, this will signal power for the throttle through the H-Bridge motor controller </w:t>
-      </w:r>
-      <w:proofErr w:type="gramStart"/>
-      <w:r>
-        <w:rPr>
-          <w:color w:val="000000" w:themeColor="text1"/>
-        </w:rPr>
-        <w:t>and also</w:t>
-      </w:r>
-      <w:proofErr w:type="gramEnd"/>
-      <w:r>
-        <w:rPr>
-          <w:color w:val="000000" w:themeColor="text1"/>
-        </w:rPr>
-        <w:t xml:space="preserve"> steering motor controls.  For use on the </w:t>
-      </w:r>
-      <w:r>
-        <w:rPr>
-          <w:color w:val="000000" w:themeColor="text1"/>
-        </w:rPr>
-        <w:lastRenderedPageBreak/>
-        <w:t xml:space="preserve">car, it is simply mounted on the dashboard using nuts and bolts, and the corresponding 3D printed mount (eventually machined out of carbon steel). </w:t>
+        <w:t xml:space="preserve">The joy-stick integrated kid car is a redesign of traditional steering and throttle controls. The functioning portion of this new joystick is implemented into the car’s original wiring circuit using a H-Bridge DC Motor Controller. For each positive or negative x and y direction, the joystick assigns all four switches to one specific direction. With each input, this will signal power for the throttle through the H-Bridge motor controller and also steering motor controls.  For use on the car, it is simply mounted on the dashboard using nuts and bolts, and the corresponding 3D printed mount (eventually machined out of carbon steel). </w:t>
       </w:r>
       <w:hyperlink w:anchor="Bookmark3" w:history="1">
         <w:r>
@@ -2458,21 +2307,7 @@
         <w:rPr>
           <w:color w:val="000000" w:themeColor="text1"/>
         </w:rPr>
-        <w:t xml:space="preserve">). The design functions </w:t>
-      </w:r>
-      <w:proofErr w:type="gramStart"/>
-      <w:r>
-        <w:rPr>
-          <w:color w:val="000000" w:themeColor="text1"/>
-        </w:rPr>
-        <w:t>similar to</w:t>
-      </w:r>
-      <w:proofErr w:type="gramEnd"/>
-      <w:r>
-        <w:rPr>
-          <w:color w:val="000000" w:themeColor="text1"/>
-        </w:rPr>
-        <w:t xml:space="preserve"> a washer where it will mount on the original steering wheel location. Two bolts will run through the top (the side where the joystick extrudes), and below there will be two nuts securing the simple assembly in place.</w:t>
+        <w:t>). The design functions similar to a washer where it will mount on the original steering wheel location. Two bolts will run through the top (the side where the joystick extrudes), and below there will be two nuts securing the simple assembly in place.</w:t>
       </w:r>
       <w:r>
         <w:rPr>
@@ -2726,14 +2561,7 @@
         <w:rPr>
           <w:color w:val="000000" w:themeColor="text1"/>
         </w:rPr>
-        <w:t xml:space="preserve">, two for </w:t>
-      </w:r>
-      <w:r>
-        <w:rPr>
-          <w:color w:val="000000" w:themeColor="text1"/>
-        </w:rPr>
-        <w:lastRenderedPageBreak/>
-        <w:t>inhibiting direction (</w:t>
+        <w:t>, two for inhibiting direction (</w:t>
       </w:r>
       <w:r>
         <w:rPr>
@@ -2958,21 +2786,7 @@
         <w:rPr>
           <w:color w:val="000000" w:themeColor="text1"/>
         </w:rPr>
-        <w:t xml:space="preserve">. When a signal comes through the Trigger pin, it goes through the circuit within the 555 and then a capacitor and resistor attached to the discharge and threshold pins which controls how long a pulse is sent out of the output pin. For this project, the 555 is operated in monostable mode, meaning it sends out a singular pulse and then returns to its original state. To get the pulse to last for a certain time, the equation T=1.1RC where </w:t>
-      </w:r>
-      <w:proofErr w:type="spellStart"/>
-      <w:r>
-        <w:rPr>
-          <w:color w:val="000000" w:themeColor="text1"/>
-        </w:rPr>
-        <w:t>T</w:t>
-      </w:r>
-      <w:proofErr w:type="spellEnd"/>
-      <w:r>
-        <w:rPr>
-          <w:color w:val="000000" w:themeColor="text1"/>
-        </w:rPr>
-        <w:t xml:space="preserve"> is time, R is the strength of the resistor, and C is the value of the capacitor. For the motor a 1 second pulse is needed so values of a100kΩ resistor and a 10µF capacitor are needed. [</w:t>
+        <w:t>. When a signal comes through the Trigger pin, it goes through the circuit within the 555 and then a capacitor and resistor attached to the discharge and threshold pins which controls how long a pulse is sent out of the output pin. For this project, the 555 is operated in monostable mode, meaning it sends out a singular pulse and then returns to its original state. To get the pulse to last for a certain time, the equation T=1.1RC where T is time, R is the strength of the resistor, and C is the value of the capacitor. For the motor a 1 second pulse is needed so values of a100kΩ resistor and a 10µF capacitor are needed. [</w:t>
       </w:r>
       <w:r>
         <w:rPr>
@@ -3047,21 +2861,7 @@
         <w:rPr>
           <w:color w:val="000000" w:themeColor="text1"/>
         </w:rPr>
-        <w:t xml:space="preserve"> that this toggled system would lead to the output of the 555 </w:t>
-      </w:r>
-      <w:proofErr w:type="gramStart"/>
-      <w:r>
-        <w:rPr>
-          <w:color w:val="000000" w:themeColor="text1"/>
-        </w:rPr>
-        <w:t>system always</w:t>
-      </w:r>
-      <w:proofErr w:type="gramEnd"/>
-      <w:r>
-        <w:rPr>
-          <w:color w:val="000000" w:themeColor="text1"/>
-        </w:rPr>
-        <w:t xml:space="preserve"> being held high. To fix this, we implemented what is called a pulse shaping module. This consists mainly of a capacitor </w:t>
+        <w:t xml:space="preserve"> that this toggled system would lead to the output of the 555 system always being held high. To fix this, we implemented what is called a pulse shaping module. This consists mainly of a capacitor </w:t>
       </w:r>
       <w:r>
         <w:rPr>
@@ -3073,21 +2873,7 @@
         <w:rPr>
           <w:color w:val="000000" w:themeColor="text1"/>
         </w:rPr>
-        <w:t xml:space="preserve"> allowing a transistor to drain a power source </w:t>
-      </w:r>
-      <w:proofErr w:type="gramStart"/>
-      <w:r>
-        <w:rPr>
-          <w:color w:val="000000" w:themeColor="text1"/>
-        </w:rPr>
-        <w:t>to</w:t>
-      </w:r>
-      <w:proofErr w:type="gramEnd"/>
-      <w:r>
-        <w:rPr>
-          <w:color w:val="000000" w:themeColor="text1"/>
-        </w:rPr>
-        <w:t xml:space="preserve"> ground, creating a quick pulse of electricity that the 555 </w:t>
+        <w:t xml:space="preserve"> allowing a transistor to drain a power source to ground, creating a quick pulse of electricity that the 555 </w:t>
       </w:r>
       <w:r>
         <w:rPr>
@@ -3244,14 +3030,7 @@
         <w:rPr>
           <w:color w:val="000000" w:themeColor="text1"/>
         </w:rPr>
-        <w:t xml:space="preserve">This design is intended to serve as an alternative to the standard electric toy car currently available on the market for children. Vehicle control is achieved through a joystick interface that replaces both steering and throttle functions. When the </w:t>
-      </w:r>
-      <w:r>
-        <w:rPr>
-          <w:color w:val="000000" w:themeColor="text1"/>
-        </w:rPr>
-        <w:lastRenderedPageBreak/>
-        <w:t>user pushes up, down, right, or left on the joystick, the car will accelerate or turn towards the given direction. This method allows the user to interact with the vehicle in a more intuitive and accessible manner. Additionally, this design also aids in the issue that some children may have, where they cannot operate the standard toy car controls independently.</w:t>
+        <w:t>This design is intended to serve as an alternative to the standard electric toy car currently available on the market for children. Vehicle control is achieved through a joystick interface that replaces both steering and throttle functions. When the user pushes up, down, right, or left on the joystick, the car will accelerate or turn towards the given direction. This method allows the user to interact with the vehicle in a more intuitive and accessible manner. Additionally, this design also aids in the issue that some children may have, where they cannot operate the standard toy car controls independently.</w:t>
       </w:r>
     </w:p>
     <w:p>
@@ -3411,23 +3190,7 @@
           <w:rFonts w:ascii="Times New Roman" w:eastAsia="Times New Roman" w:hAnsi="Times New Roman" w:cs="Times New Roman"/>
           <w:color w:val="000000" w:themeColor="text1"/>
         </w:rPr>
-        <w:t xml:space="preserve">The electric ride on car was evaluated against the specified design requirements through structed user testing and system performance checks. Each criterion, directional control, steering consistency, power limit, heat limit, and size requirement, was assessed during real world operation to ensure the design met both functional and safety expectations. Users operated the vehicle under normal conditions, allowing the team to observe control, responsiveness, and overall usability. The system was required to satisfy all evaluation criteria </w:t>
-      </w:r>
-      <w:proofErr w:type="gramStart"/>
-      <w:r>
-        <w:rPr>
-          <w:rFonts w:ascii="Times New Roman" w:eastAsia="Times New Roman" w:hAnsi="Times New Roman" w:cs="Times New Roman"/>
-          <w:color w:val="000000" w:themeColor="text1"/>
-        </w:rPr>
-        <w:t>in order to</w:t>
-      </w:r>
-      <w:proofErr w:type="gramEnd"/>
-      <w:r>
-        <w:rPr>
-          <w:rFonts w:ascii="Times New Roman" w:eastAsia="Times New Roman" w:hAnsi="Times New Roman" w:cs="Times New Roman"/>
-          <w:color w:val="000000" w:themeColor="text1"/>
-        </w:rPr>
-        <w:t xml:space="preserve"> be considered successful. Testing results showed that the ride on car met all the design requirements, demonstrating reliable performance, safe operations, and suitability for its intended use.  </w:t>
+        <w:t xml:space="preserve">The electric ride on car was evaluated against the specified design requirements through structed user testing and system performance checks. Each criterion, directional control, steering consistency, power limit, heat limit, and size requirement, was assessed during real world operation to ensure the design met both functional and safety expectations. Users operated the vehicle under normal conditions, allowing the team to observe control, responsiveness, and overall usability. The system was required to satisfy all evaluation criteria in order to be considered successful. Testing results showed that the ride on car met all the design requirements, demonstrating reliable performance, safe operations, and suitability for its intended use.  </w:t>
       </w:r>
     </w:p>
     <w:p>
@@ -3644,7 +3407,6 @@
         </w:rPr>
         <w:t xml:space="preserve">The evaluation of this design criteria requires that the user manually </w:t>
       </w:r>
-      <w:proofErr w:type="gramStart"/>
       <w:r>
         <w:rPr>
           <w:rFonts w:ascii="Times New Roman" w:eastAsia="Times New Roman" w:hAnsi="Times New Roman" w:cs="Times New Roman"/>
@@ -3652,21 +3414,12 @@
         </w:rPr>
         <w:t>push</w:t>
       </w:r>
-      <w:proofErr w:type="gramEnd"/>
-      <w:r>
-        <w:rPr>
-          <w:rFonts w:ascii="Times New Roman" w:eastAsia="Times New Roman" w:hAnsi="Times New Roman" w:cs="Times New Roman"/>
-          <w:color w:val="000000" w:themeColor="text1"/>
-        </w:rPr>
-        <w:t xml:space="preserve"> the joystick in each direction, forward, backward, left, and right. This was tested in two ways, a static test, elevating the car off a flat surface so that the wheels can spin freely allowing the testers to visually see the steering response. And a dynamic test, driving the car through a specially crafted course designed with turns </w:t>
-      </w:r>
-      <w:r>
-        <w:rPr>
-          <w:rFonts w:ascii="Times New Roman" w:eastAsia="Times New Roman" w:hAnsi="Times New Roman" w:cs="Times New Roman"/>
-          <w:color w:val="000000" w:themeColor="text1"/>
-        </w:rPr>
-        <w:lastRenderedPageBreak/>
-        <w:t xml:space="preserve">and corners to test the steering compacity while in motion. </w:t>
+      <w:r>
+        <w:rPr>
+          <w:rFonts w:ascii="Times New Roman" w:eastAsia="Times New Roman" w:hAnsi="Times New Roman" w:cs="Times New Roman"/>
+          <w:color w:val="000000" w:themeColor="text1"/>
+        </w:rPr>
+        <w:t xml:space="preserve"> the joystick in each direction, forward, backward, left, and right. This was tested in two ways, a static test, elevating the car off a flat surface so that the wheels can spin freely allowing the testers to visually see the steering response. And a dynamic test, driving the car through a specially crafted course designed with turns and corners to test the steering compacity while in motion. </w:t>
       </w:r>
       <w:r>
         <w:rPr>
@@ -3799,7 +3552,6 @@
           <w:bCs/>
           <w:color w:val="000000" w:themeColor="text1"/>
         </w:rPr>
-        <w:lastRenderedPageBreak/>
         <w:t xml:space="preserve"> </w:t>
       </w:r>
       <w:r>
@@ -3950,23 +3702,7 @@
           <w:rFonts w:ascii="Times New Roman" w:eastAsia="Times New Roman" w:hAnsi="Times New Roman" w:cs="Times New Roman"/>
           <w:color w:val="000000" w:themeColor="text1"/>
         </w:rPr>
-        <w:t xml:space="preserve">nfluences. A straight reference line was established using a tape measure at a fixed distance placed longitudinally along the test path. The electric ride on was aligned so that its centerline coincided with the reference line at the starting position. The vehicle was positioned at a consistent starting distance for each trial to ensure repeatability. During testing, the car was allowed to travel forward along the reference line while lateral deviation from the centerline was visually monitored and measured relative to the ruler. All tests were performed under identical surface and </w:t>
-      </w:r>
-      <w:proofErr w:type="gramStart"/>
-      <w:r>
-        <w:rPr>
-          <w:rFonts w:ascii="Times New Roman" w:eastAsia="Times New Roman" w:hAnsi="Times New Roman" w:cs="Times New Roman"/>
-          <w:color w:val="000000" w:themeColor="text1"/>
-        </w:rPr>
-        <w:t>environment</w:t>
-      </w:r>
-      <w:proofErr w:type="gramEnd"/>
-      <w:r>
-        <w:rPr>
-          <w:rFonts w:ascii="Times New Roman" w:eastAsia="Times New Roman" w:hAnsi="Times New Roman" w:cs="Times New Roman"/>
-          <w:color w:val="000000" w:themeColor="text1"/>
-        </w:rPr>
-        <w:t xml:space="preserve"> conditions to ensure consistent results. </w:t>
+        <w:t xml:space="preserve">nfluences. A straight reference line was established using a tape measure at a fixed distance placed longitudinally along the test path. The electric ride on was aligned so that its centerline coincided with the reference line at the starting position. The vehicle was positioned at a consistent starting distance for each trial to ensure repeatability. During testing, the car was allowed to travel forward along the reference line while lateral deviation from the centerline was visually monitored and measured relative to the ruler. All tests were performed under identical surface and environment conditions to ensure consistent results. </w:t>
       </w:r>
     </w:p>
     <w:p>
@@ -4014,65 +3750,7 @@
           <w:rFonts w:ascii="Times New Roman" w:eastAsia="Times New Roman" w:hAnsi="Times New Roman" w:cs="Times New Roman"/>
           <w:color w:val="000000" w:themeColor="text1"/>
         </w:rPr>
-        <w:t xml:space="preserve">The straight-line steering consistency test produced lateral drift across multiple trials and test length ranging from approximately 10 – 15ft. measured drift values varied significantly between trials, indicating nonuniform steering behavior under constant joystick input. Server trials remained within the ±6 in acceptance tolerance, deviations were small and showed no progressive drift over the test distance. </w:t>
-      </w:r>
-      <w:proofErr w:type="gramStart"/>
-      <w:r>
-        <w:rPr>
-          <w:rFonts w:ascii="Times New Roman" w:eastAsia="Times New Roman" w:hAnsi="Times New Roman" w:cs="Times New Roman"/>
-          <w:color w:val="000000" w:themeColor="text1"/>
-        </w:rPr>
-        <w:t>However</w:t>
-      </w:r>
-      <w:proofErr w:type="gramEnd"/>
-      <w:r>
-        <w:rPr>
-          <w:rFonts w:ascii="Times New Roman" w:eastAsia="Times New Roman" w:hAnsi="Times New Roman" w:cs="Times New Roman"/>
-          <w:color w:val="000000" w:themeColor="text1"/>
-        </w:rPr>
-        <w:t xml:space="preserve"> few outliers appeared in the </w:t>
-      </w:r>
-      <w:proofErr w:type="gramStart"/>
-      <w:r>
-        <w:rPr>
-          <w:rFonts w:ascii="Times New Roman" w:eastAsia="Times New Roman" w:hAnsi="Times New Roman" w:cs="Times New Roman"/>
-          <w:color w:val="000000" w:themeColor="text1"/>
-        </w:rPr>
-        <w:t>tests</w:t>
-      </w:r>
-      <w:proofErr w:type="gramEnd"/>
-      <w:r>
-        <w:rPr>
-          <w:rFonts w:ascii="Times New Roman" w:eastAsia="Times New Roman" w:hAnsi="Times New Roman" w:cs="Times New Roman"/>
-          <w:color w:val="000000" w:themeColor="text1"/>
-        </w:rPr>
-        <w:t xml:space="preserve"> but they were ruled out for being user error and were taken note of but not deemed important to the </w:t>
-      </w:r>
-      <w:proofErr w:type="spellStart"/>
-      <w:proofErr w:type="gramStart"/>
-      <w:r>
-        <w:rPr>
-          <w:rFonts w:ascii="Times New Roman" w:eastAsia="Times New Roman" w:hAnsi="Times New Roman" w:cs="Times New Roman"/>
-          <w:color w:val="000000" w:themeColor="text1"/>
-        </w:rPr>
-        <w:t>over all</w:t>
-      </w:r>
-      <w:proofErr w:type="spellEnd"/>
-      <w:proofErr w:type="gramEnd"/>
-      <w:r>
-        <w:rPr>
-          <w:rFonts w:ascii="Times New Roman" w:eastAsia="Times New Roman" w:hAnsi="Times New Roman" w:cs="Times New Roman"/>
-          <w:color w:val="000000" w:themeColor="text1"/>
-        </w:rPr>
-        <w:t xml:space="preserve"> trials. Within this acceptance range, deviations were small and showed no progressive drift over the test distance. The compliant data demonstrates repeatable straight line tracking performance under consistent input conditions. The </w:t>
-      </w:r>
-      <w:proofErr w:type="gramStart"/>
-      <w:r>
-        <w:rPr>
-          <w:rFonts w:ascii="Times New Roman" w:eastAsia="Times New Roman" w:hAnsi="Times New Roman" w:cs="Times New Roman"/>
-          <w:color w:val="000000" w:themeColor="text1"/>
-        </w:rPr>
-        <w:t>in</w:t>
+        <w:t>The straight-line steering consistency test produced lateral drift across multiple trials and test length ranging from approximately 10 – 15ft. measured drift values varied significantly between trials, indicating nonuniform steering behavior under constant joystick input. Server trials remained within the ±6 in acceptance tolerance, deviations were small and showed no progressive drift over the test distance. However few outliers appeared in the tests but they were ruled out for being user error and were taken note of but not deemed important to the over all trials. Within this acceptance range, deviations were small and showed no progressive drift over the test distance. The compliant data demonstrates repeatable straight line tracking performance under consistent input conditions. The in</w:t>
       </w:r>
       <w:r>
         <w:rPr>
@@ -4086,55 +3764,7 @@
           <w:rFonts w:ascii="Times New Roman" w:eastAsia="Times New Roman" w:hAnsi="Times New Roman" w:cs="Times New Roman"/>
           <w:color w:val="000000" w:themeColor="text1"/>
         </w:rPr>
-        <w:t>tolerance</w:t>
-      </w:r>
-      <w:proofErr w:type="gramEnd"/>
-      <w:r>
-        <w:rPr>
-          <w:rFonts w:ascii="Times New Roman" w:eastAsia="Times New Roman" w:hAnsi="Times New Roman" w:cs="Times New Roman"/>
-          <w:color w:val="000000" w:themeColor="text1"/>
-        </w:rPr>
-        <w:t xml:space="preserve"> results indicate that the </w:t>
-      </w:r>
-      <w:r>
-        <w:rPr>
-          <w:rFonts w:ascii="Times New Roman" w:eastAsia="Times New Roman" w:hAnsi="Times New Roman" w:cs="Times New Roman"/>
-          <w:color w:val="000000" w:themeColor="text1"/>
-        </w:rPr>
-        <w:lastRenderedPageBreak/>
-        <w:t xml:space="preserve">steering system </w:t>
-      </w:r>
-      <w:proofErr w:type="gramStart"/>
-      <w:r>
-        <w:rPr>
-          <w:rFonts w:ascii="Times New Roman" w:eastAsia="Times New Roman" w:hAnsi="Times New Roman" w:cs="Times New Roman"/>
-          <w:color w:val="000000" w:themeColor="text1"/>
-        </w:rPr>
-        <w:t>is capable of maintaining</w:t>
-      </w:r>
-      <w:proofErr w:type="gramEnd"/>
-      <w:r>
-        <w:rPr>
-          <w:rFonts w:ascii="Times New Roman" w:eastAsia="Times New Roman" w:hAnsi="Times New Roman" w:cs="Times New Roman"/>
-          <w:color w:val="000000" w:themeColor="text1"/>
-        </w:rPr>
-        <w:t xml:space="preserve"> an acceptably straight trajectory when commanded with fixed forward input. The limited magnitude of lateral deviation suggests that the mechanical steering alignment and control response are sufficient for stable, predictable operation in the finished design. These results support the conclusion that, within defined performance limits, the steering system meets the consistency requirement. Maintaining deviation with ±6 inches </w:t>
-      </w:r>
-      <w:proofErr w:type="gramStart"/>
-      <w:r>
-        <w:rPr>
-          <w:rFonts w:ascii="Times New Roman" w:eastAsia="Times New Roman" w:hAnsi="Times New Roman" w:cs="Times New Roman"/>
-          <w:color w:val="000000" w:themeColor="text1"/>
-        </w:rPr>
-        <w:t>ensures</w:t>
-      </w:r>
-      <w:proofErr w:type="gramEnd"/>
-      <w:r>
-        <w:rPr>
-          <w:rFonts w:ascii="Times New Roman" w:eastAsia="Times New Roman" w:hAnsi="Times New Roman" w:cs="Times New Roman"/>
-          <w:color w:val="000000" w:themeColor="text1"/>
-        </w:rPr>
-        <w:t xml:space="preserve"> adequate controllability and user confidence during straight line motion. </w:t>
+        <w:t xml:space="preserve">tolerance results indicate that the steering system is capable of maintaining an acceptably straight trajectory when commanded with fixed forward input. The limited magnitude of lateral deviation suggests that the mechanical steering alignment and control response are sufficient for stable, predictable operation in the finished design. These results support the conclusion that, within defined performance limits, the steering system meets the consistency requirement. Maintaining deviation with ±6 inches ensures adequate controllability and user confidence during straight line motion. </w:t>
       </w:r>
     </w:p>
     <w:p>
@@ -4275,39 +3905,7 @@
           <w:rFonts w:ascii="Times New Roman" w:eastAsia="Times New Roman" w:hAnsi="Times New Roman" w:cs="Times New Roman"/>
           <w:color w:val="000000" w:themeColor="text1"/>
         </w:rPr>
-        <w:t xml:space="preserve">he power limit requirement was evaluated by measuring electrical current and voltage at key </w:t>
-      </w:r>
-      <w:proofErr w:type="gramStart"/>
-      <w:r>
-        <w:rPr>
-          <w:rFonts w:ascii="Times New Roman" w:eastAsia="Times New Roman" w:hAnsi="Times New Roman" w:cs="Times New Roman"/>
-          <w:color w:val="000000" w:themeColor="text1"/>
-        </w:rPr>
-        <w:t>point</w:t>
-      </w:r>
-      <w:proofErr w:type="gramEnd"/>
-      <w:r>
-        <w:rPr>
-          <w:rFonts w:ascii="Times New Roman" w:eastAsia="Times New Roman" w:hAnsi="Times New Roman" w:cs="Times New Roman"/>
-          <w:color w:val="000000" w:themeColor="text1"/>
-        </w:rPr>
-        <w:t xml:space="preserve"> throughout the </w:t>
-      </w:r>
-      <w:proofErr w:type="gramStart"/>
-      <w:r>
-        <w:rPr>
-          <w:rFonts w:ascii="Times New Roman" w:eastAsia="Times New Roman" w:hAnsi="Times New Roman" w:cs="Times New Roman"/>
-          <w:color w:val="000000" w:themeColor="text1"/>
-        </w:rPr>
-        <w:t>vehicles</w:t>
-      </w:r>
-      <w:proofErr w:type="gramEnd"/>
-      <w:r>
-        <w:rPr>
-          <w:rFonts w:ascii="Times New Roman" w:eastAsia="Times New Roman" w:hAnsi="Times New Roman" w:cs="Times New Roman"/>
-          <w:color w:val="000000" w:themeColor="text1"/>
-        </w:rPr>
-        <w:t xml:space="preserve"> electrical system. A multimeter was used to monitor voltage and current in selected wiring segments supplying the motor and control electronics during operation. Testing verified that system voltage remained below 12 V and that operating current did not exceed the specified limit of a 3 amp under normal driving conditions. Measurements were taken while the vehicle was powered and active to ensure compliance under realistic load conditions.</w:t>
+        <w:t>he power limit requirement was evaluated by measuring electrical current and voltage at key point throughout the vehicles electrical system. A multimeter was used to monitor voltage and current in selected wiring segments supplying the motor and control electronics during operation. Testing verified that system voltage remained below 12 V and that operating current did not exceed the specified limit of a 3 amp under normal driving conditions. Measurements were taken while the vehicle was powered and active to ensure compliance under realistic load conditions.</w:t>
       </w:r>
       <w:r>
         <w:rPr>
@@ -4369,63 +3967,7 @@
           <w:rFonts w:ascii="Times New Roman" w:eastAsia="Times New Roman" w:hAnsi="Times New Roman" w:cs="Times New Roman"/>
           <w:color w:val="000000" w:themeColor="text1"/>
         </w:rPr>
-        <w:t xml:space="preserve">Power limit testing confirmed that the electrical system operated within the defined constraints during all the </w:t>
-      </w:r>
-      <w:r>
-        <w:rPr>
-          <w:rFonts w:ascii="Times New Roman" w:eastAsia="Times New Roman" w:hAnsi="Times New Roman" w:cs="Times New Roman"/>
-          <w:color w:val="000000" w:themeColor="text1"/>
-        </w:rPr>
-        <w:lastRenderedPageBreak/>
-        <w:t xml:space="preserve">testing conditions. Measured system voltage remained below the maximum allowable limit of 12V, and operating current did not exceed 3 amps at any monitored location. All </w:t>
-      </w:r>
-      <w:proofErr w:type="gramStart"/>
-      <w:r>
-        <w:rPr>
-          <w:rFonts w:ascii="Times New Roman" w:eastAsia="Times New Roman" w:hAnsi="Times New Roman" w:cs="Times New Roman"/>
-          <w:color w:val="000000" w:themeColor="text1"/>
-        </w:rPr>
-        <w:t>measurements points</w:t>
-      </w:r>
-      <w:proofErr w:type="gramEnd"/>
-      <w:r>
-        <w:rPr>
-          <w:rFonts w:ascii="Times New Roman" w:eastAsia="Times New Roman" w:hAnsi="Times New Roman" w:cs="Times New Roman"/>
-          <w:color w:val="000000" w:themeColor="text1"/>
-        </w:rPr>
-        <w:t xml:space="preserve"> across the battery, motor supply, and control wiring remained within the specified limits under both stationary and dynamic operating conditions, as a </w:t>
-      </w:r>
-      <w:proofErr w:type="gramStart"/>
-      <w:r>
-        <w:rPr>
-          <w:rFonts w:ascii="Times New Roman" w:eastAsia="Times New Roman" w:hAnsi="Times New Roman" w:cs="Times New Roman"/>
-          <w:color w:val="000000" w:themeColor="text1"/>
-        </w:rPr>
-        <w:t>results</w:t>
-      </w:r>
-      <w:proofErr w:type="gramEnd"/>
-      <w:r>
-        <w:rPr>
-          <w:rFonts w:ascii="Times New Roman" w:eastAsia="Times New Roman" w:hAnsi="Times New Roman" w:cs="Times New Roman"/>
-          <w:color w:val="000000" w:themeColor="text1"/>
-        </w:rPr>
-        <w:t xml:space="preserve">, the power limit requirements </w:t>
-      </w:r>
-      <w:proofErr w:type="gramStart"/>
-      <w:r>
-        <w:rPr>
-          <w:rFonts w:ascii="Times New Roman" w:eastAsia="Times New Roman" w:hAnsi="Times New Roman" w:cs="Times New Roman"/>
-          <w:color w:val="000000" w:themeColor="text1"/>
-        </w:rPr>
-        <w:t>was</w:t>
-      </w:r>
-      <w:proofErr w:type="gramEnd"/>
-      <w:r>
-        <w:rPr>
-          <w:rFonts w:ascii="Times New Roman" w:eastAsia="Times New Roman" w:hAnsi="Times New Roman" w:cs="Times New Roman"/>
-          <w:color w:val="000000" w:themeColor="text1"/>
-        </w:rPr>
-        <w:t xml:space="preserve"> successfully met for all tests.</w:t>
+        <w:t>Power limit testing confirmed that the electrical system operated within the defined constraints during all the testing conditions. Measured system voltage remained below the maximum allowable limit of 12V, and operating current did not exceed 3 amps at any monitored location. All measurements points across the battery, motor supply, and control wiring remained within the specified limits under both stationary and dynamic operating conditions, as a results, the power limit requirements was successfully met for all tests.</w:t>
       </w:r>
       <w:r>
         <w:rPr>
@@ -4600,55 +4142,7 @@
           <w:rFonts w:ascii="Times New Roman" w:eastAsia="Times New Roman" w:hAnsi="Times New Roman" w:cs="Times New Roman"/>
           <w:color w:val="000000" w:themeColor="text1"/>
         </w:rPr>
-        <w:t xml:space="preserve">The purpose of the heat limit requirement is to ensure that the electrical and mechanical components of the electric ride on car operate within safe temperature ranges during normal use. Limiting heat buildup prevents thermal damage, </w:t>
-      </w:r>
-      <w:proofErr w:type="gramStart"/>
-      <w:r>
-        <w:rPr>
-          <w:rFonts w:ascii="Times New Roman" w:eastAsia="Times New Roman" w:hAnsi="Times New Roman" w:cs="Times New Roman"/>
-          <w:color w:val="000000" w:themeColor="text1"/>
-        </w:rPr>
-        <w:t>reduced</w:t>
-      </w:r>
-      <w:proofErr w:type="gramEnd"/>
-      <w:r>
-        <w:rPr>
-          <w:rFonts w:ascii="Times New Roman" w:eastAsia="Times New Roman" w:hAnsi="Times New Roman" w:cs="Times New Roman"/>
-          <w:color w:val="000000" w:themeColor="text1"/>
-        </w:rPr>
-        <w:t xml:space="preserve"> the risk of components failure, ensures user safety. </w:t>
-      </w:r>
-      <w:proofErr w:type="gramStart"/>
-      <w:r>
-        <w:rPr>
-          <w:rFonts w:ascii="Times New Roman" w:eastAsia="Times New Roman" w:hAnsi="Times New Roman" w:cs="Times New Roman"/>
-          <w:color w:val="000000" w:themeColor="text1"/>
-        </w:rPr>
-        <w:t>This requirements</w:t>
-      </w:r>
-      <w:proofErr w:type="gramEnd"/>
-      <w:r>
-        <w:rPr>
-          <w:rFonts w:ascii="Times New Roman" w:eastAsia="Times New Roman" w:hAnsi="Times New Roman" w:cs="Times New Roman"/>
-          <w:color w:val="000000" w:themeColor="text1"/>
-        </w:rPr>
-        <w:t xml:space="preserve"> </w:t>
-      </w:r>
-      <w:proofErr w:type="gramStart"/>
-      <w:r>
-        <w:rPr>
-          <w:rFonts w:ascii="Times New Roman" w:eastAsia="Times New Roman" w:hAnsi="Times New Roman" w:cs="Times New Roman"/>
-          <w:color w:val="000000" w:themeColor="text1"/>
-        </w:rPr>
-        <w:t>supports</w:t>
-      </w:r>
-      <w:proofErr w:type="gramEnd"/>
-      <w:r>
-        <w:rPr>
-          <w:rFonts w:ascii="Times New Roman" w:eastAsia="Times New Roman" w:hAnsi="Times New Roman" w:cs="Times New Roman"/>
-          <w:color w:val="000000" w:themeColor="text1"/>
-        </w:rPr>
-        <w:t xml:space="preserve"> system reliability longevity and consistent performance throughout operation. </w:t>
+        <w:t xml:space="preserve">The purpose of the heat limit requirement is to ensure that the electrical and mechanical components of the electric ride on car operate within safe temperature ranges during normal use. Limiting heat buildup prevents thermal damage, reduced the risk of components failure, ensures user safety. This requirements supports system reliability longevity and consistent performance throughout operation. </w:t>
       </w:r>
     </w:p>
     <w:p>
@@ -4701,47 +4195,7 @@
           <w:rFonts w:ascii="Times New Roman" w:eastAsia="Times New Roman" w:hAnsi="Times New Roman" w:cs="Times New Roman"/>
           <w:color w:val="000000" w:themeColor="text1"/>
         </w:rPr>
-        <w:t xml:space="preserve">eat limit was conducted using an Arduino microcontroller interfaced with a temperature sensor mounted directly to the motor casing to measure operating temperature. The sensor was secured to ensure consistent thermal contact and accurate temperature readings throughout the test. The electric ride on car was placed in a stationary configuration to allow continuous motor operation without external interruptions. Power was supplied under </w:t>
-      </w:r>
-      <w:r>
-        <w:rPr>
-          <w:rFonts w:ascii="Times New Roman" w:eastAsia="Times New Roman" w:hAnsi="Times New Roman" w:cs="Times New Roman"/>
-          <w:color w:val="000000" w:themeColor="text1"/>
-        </w:rPr>
-        <w:lastRenderedPageBreak/>
-        <w:t xml:space="preserve">normal operating voltage, and the motors were run continuously for a </w:t>
-      </w:r>
-      <w:proofErr w:type="gramStart"/>
-      <w:r>
-        <w:rPr>
-          <w:rFonts w:ascii="Times New Roman" w:eastAsia="Times New Roman" w:hAnsi="Times New Roman" w:cs="Times New Roman"/>
-          <w:color w:val="000000" w:themeColor="text1"/>
-        </w:rPr>
-        <w:t>15 minute</w:t>
-      </w:r>
-      <w:proofErr w:type="gramEnd"/>
-      <w:r>
-        <w:rPr>
-          <w:rFonts w:ascii="Times New Roman" w:eastAsia="Times New Roman" w:hAnsi="Times New Roman" w:cs="Times New Roman"/>
-          <w:color w:val="000000" w:themeColor="text1"/>
-        </w:rPr>
-        <w:t xml:space="preserve"> duration. Temperature reading </w:t>
-      </w:r>
-      <w:proofErr w:type="gramStart"/>
-      <w:r>
-        <w:rPr>
-          <w:rFonts w:ascii="Times New Roman" w:eastAsia="Times New Roman" w:hAnsi="Times New Roman" w:cs="Times New Roman"/>
-          <w:color w:val="000000" w:themeColor="text1"/>
-        </w:rPr>
-        <w:t>were</w:t>
-      </w:r>
-      <w:proofErr w:type="gramEnd"/>
-      <w:r>
-        <w:rPr>
-          <w:rFonts w:ascii="Times New Roman" w:eastAsia="Times New Roman" w:hAnsi="Times New Roman" w:cs="Times New Roman"/>
-          <w:color w:val="000000" w:themeColor="text1"/>
-        </w:rPr>
-        <w:t xml:space="preserve"> monitored in real time through the Arduino system to verify that the motor temperature remained below the maximum allowable limit of 113 °F for the entire test period.</w:t>
+        <w:t>eat limit was conducted using an Arduino microcontroller interfaced with a temperature sensor mounted directly to the motor casing to measure operating temperature. The sensor was secured to ensure consistent thermal contact and accurate temperature readings throughout the test. The electric ride on car was placed in a stationary configuration to allow continuous motor operation without external interruptions. Power was supplied under normal operating voltage, and the motors were run continuously for a 15 minute duration. Temperature reading were monitored in real time through the Arduino system to verify that the motor temperature remained below the maximum allowable limit of 113 °F for the entire test period.</w:t>
       </w:r>
     </w:p>
     <w:p>
@@ -4780,103 +4234,7 @@
           <w:rFonts w:ascii="Times New Roman" w:eastAsia="Times New Roman" w:hAnsi="Times New Roman" w:cs="Times New Roman"/>
           <w:color w:val="000000" w:themeColor="text1"/>
         </w:rPr>
-        <w:t xml:space="preserve">The heat limit requirement was considered satisfied based on qualitative observation during vehicle operation. Although a full 15 </w:t>
-      </w:r>
-      <w:proofErr w:type="gramStart"/>
-      <w:r>
-        <w:rPr>
-          <w:rFonts w:ascii="Times New Roman" w:eastAsia="Times New Roman" w:hAnsi="Times New Roman" w:cs="Times New Roman"/>
-          <w:color w:val="000000" w:themeColor="text1"/>
-        </w:rPr>
-        <w:t>minute controlled</w:t>
-      </w:r>
-      <w:proofErr w:type="gramEnd"/>
-      <w:r>
-        <w:rPr>
-          <w:rFonts w:ascii="Times New Roman" w:eastAsia="Times New Roman" w:hAnsi="Times New Roman" w:cs="Times New Roman"/>
-          <w:color w:val="000000" w:themeColor="text1"/>
-        </w:rPr>
-        <w:t xml:space="preserve"> temperature test was not completed due to time constraints, the motor was operated during multiple system tests without exhibiting signs of excessive heat </w:t>
-      </w:r>
-      <w:proofErr w:type="spellStart"/>
-      <w:r>
-        <w:rPr>
-          <w:rFonts w:ascii="Times New Roman" w:eastAsia="Times New Roman" w:hAnsi="Times New Roman" w:cs="Times New Roman"/>
-          <w:color w:val="000000" w:themeColor="text1"/>
-        </w:rPr>
-        <w:t>build up</w:t>
-      </w:r>
-      <w:proofErr w:type="spellEnd"/>
-      <w:r>
-        <w:rPr>
-          <w:rFonts w:ascii="Times New Roman" w:eastAsia="Times New Roman" w:hAnsi="Times New Roman" w:cs="Times New Roman"/>
-          <w:color w:val="000000" w:themeColor="text1"/>
-        </w:rPr>
-        <w:t xml:space="preserve">. </w:t>
-      </w:r>
-      <w:proofErr w:type="gramStart"/>
-      <w:r>
-        <w:rPr>
-          <w:rFonts w:ascii="Times New Roman" w:eastAsia="Times New Roman" w:hAnsi="Times New Roman" w:cs="Times New Roman"/>
-          <w:color w:val="000000" w:themeColor="text1"/>
-        </w:rPr>
-        <w:t>Though</w:t>
-      </w:r>
-      <w:proofErr w:type="gramEnd"/>
-      <w:r>
-        <w:rPr>
-          <w:rFonts w:ascii="Times New Roman" w:eastAsia="Times New Roman" w:hAnsi="Times New Roman" w:cs="Times New Roman"/>
-          <w:color w:val="000000" w:themeColor="text1"/>
-        </w:rPr>
-        <w:t xml:space="preserve"> these </w:t>
-      </w:r>
-      <w:proofErr w:type="gramStart"/>
-      <w:r>
-        <w:rPr>
-          <w:rFonts w:ascii="Times New Roman" w:eastAsia="Times New Roman" w:hAnsi="Times New Roman" w:cs="Times New Roman"/>
-          <w:color w:val="000000" w:themeColor="text1"/>
-        </w:rPr>
-        <w:t>test</w:t>
-      </w:r>
-      <w:proofErr w:type="gramEnd"/>
-      <w:r>
-        <w:rPr>
-          <w:rFonts w:ascii="Times New Roman" w:eastAsia="Times New Roman" w:hAnsi="Times New Roman" w:cs="Times New Roman"/>
-          <w:color w:val="000000" w:themeColor="text1"/>
-        </w:rPr>
-        <w:t xml:space="preserve">, the motor maintained stable performance with no observable thermal degradation, shut down, or adverse response related to heat generation. Based on the motors behavior during </w:t>
-      </w:r>
-      <w:proofErr w:type="gramStart"/>
-      <w:r>
-        <w:rPr>
-          <w:rFonts w:ascii="Times New Roman" w:eastAsia="Times New Roman" w:hAnsi="Times New Roman" w:cs="Times New Roman"/>
-          <w:color w:val="000000" w:themeColor="text1"/>
-        </w:rPr>
-        <w:t>externed</w:t>
-      </w:r>
-      <w:proofErr w:type="gramEnd"/>
-      <w:r>
-        <w:rPr>
-          <w:rFonts w:ascii="Times New Roman" w:eastAsia="Times New Roman" w:hAnsi="Times New Roman" w:cs="Times New Roman"/>
-          <w:color w:val="000000" w:themeColor="text1"/>
-        </w:rPr>
-        <w:t xml:space="preserve"> use and the absence of overheating indicators, the system was determined to operate within acceptable thermal limits. Although a full duration heat test was not completed, the observed system behavior during extended operations </w:t>
-      </w:r>
-      <w:proofErr w:type="gramStart"/>
-      <w:r>
-        <w:rPr>
-          <w:rFonts w:ascii="Times New Roman" w:eastAsia="Times New Roman" w:hAnsi="Times New Roman" w:cs="Times New Roman"/>
-          <w:color w:val="000000" w:themeColor="text1"/>
-        </w:rPr>
-        <w:t>indicted</w:t>
-      </w:r>
-      <w:proofErr w:type="gramEnd"/>
-      <w:r>
-        <w:rPr>
-          <w:rFonts w:ascii="Times New Roman" w:eastAsia="Times New Roman" w:hAnsi="Times New Roman" w:cs="Times New Roman"/>
-          <w:color w:val="000000" w:themeColor="text1"/>
-        </w:rPr>
-        <w:t xml:space="preserve"> that the motor operates within acceptable thermal limits. The absence of thermal issues during sustained use suggests that the selected motor and power configuration are sufficient for the intended operating conditions. While additional quantitative temperature data would strengthen validation, the qualitative results support the conclusion that the heat generation does not pose a safety or reliability concern for the current design. Future testing with continuous temperature logging over longer duration recommended to further validate thermal performance and confirm compliance under all operating scenarios.</w:t>
+        <w:t>The heat limit requirement was considered satisfied based on qualitative observation during vehicle operation. Although a full 15 minute controlled temperature test was not completed due to time constraints, the motor was operated during multiple system tests without exhibiting signs of excessive heat build up. Though these test, the motor maintained stable performance with no observable thermal degradation, shut down, or adverse response related to heat generation. Based on the motors behavior during externed use and the absence of overheating indicators, the system was determined to operate within acceptable thermal limits. Although a full duration heat test was not completed, the observed system behavior during extended operations indicted that the motor operates within acceptable thermal limits. The absence of thermal issues during sustained use suggests that the selected motor and power configuration are sufficient for the intended operating conditions. While additional quantitative temperature data would strengthen validation, the qualitative results support the conclusion that the heat generation does not pose a safety or reliability concern for the current design. Future testing with continuous temperature logging over longer duration recommended to further validate thermal performance and confirm compliance under all operating scenarios.</w:t>
       </w:r>
     </w:p>
     <w:p>
@@ -4944,23 +4302,7 @@
           <w:rFonts w:ascii="Times New Roman" w:eastAsia="Times New Roman" w:hAnsi="Times New Roman" w:cs="Times New Roman"/>
           <w:color w:val="000000" w:themeColor="text1"/>
         </w:rPr>
-        <w:t xml:space="preserve">The joystick components were required to fit within a designated envelope of 2.75in x 3.125 in space to ensure proper integration with the vehicle. Maintaining this size constraints prevents interference with vehicle operation, preserved drivability, and </w:t>
-      </w:r>
-      <w:proofErr w:type="gramStart"/>
-      <w:r>
-        <w:rPr>
-          <w:rFonts w:ascii="Times New Roman" w:eastAsia="Times New Roman" w:hAnsi="Times New Roman" w:cs="Times New Roman"/>
-          <w:color w:val="000000" w:themeColor="text1"/>
-        </w:rPr>
-        <w:t>reduced</w:t>
-      </w:r>
-      <w:proofErr w:type="gramEnd"/>
-      <w:r>
-        <w:rPr>
-          <w:rFonts w:ascii="Times New Roman" w:eastAsia="Times New Roman" w:hAnsi="Times New Roman" w:cs="Times New Roman"/>
-          <w:color w:val="000000" w:themeColor="text1"/>
-        </w:rPr>
-        <w:t xml:space="preserve"> the likelihood of accidental contact or mechanical damage during regular use. A compact fit also supports ergonomic accessibility for the user while allowing the control system to be securely mounted and protected within the vehicle structure. </w:t>
+        <w:t xml:space="preserve">The joystick components were required to fit within a designated envelope of 2.75in x 3.125 in space to ensure proper integration with the vehicle. Maintaining this size constraints prevents interference with vehicle operation, preserved drivability, and reduced the likelihood of accidental contact or mechanical damage during regular use. A compact fit also supports ergonomic accessibility for the user while allowing the control system to be securely mounted and protected within the vehicle structure. </w:t>
       </w:r>
       <w:r>
         <w:t xml:space="preserve"> </w:t>
@@ -5003,97 +4345,7 @@
           <w:rFonts w:ascii="Times New Roman" w:eastAsia="Times New Roman" w:hAnsi="Times New Roman" w:cs="Times New Roman"/>
           <w:color w:val="000000" w:themeColor="text1"/>
         </w:rPr>
-        <w:t xml:space="preserve">Size evaluation was conducted through </w:t>
-      </w:r>
-      <w:proofErr w:type="gramStart"/>
-      <w:r>
-        <w:rPr>
-          <w:rFonts w:ascii="Times New Roman" w:eastAsia="Times New Roman" w:hAnsi="Times New Roman" w:cs="Times New Roman"/>
-          <w:color w:val="000000" w:themeColor="text1"/>
-        </w:rPr>
-        <w:t>a physical</w:t>
-      </w:r>
-      <w:proofErr w:type="gramEnd"/>
-      <w:r>
-        <w:rPr>
-          <w:rFonts w:ascii="Times New Roman" w:eastAsia="Times New Roman" w:hAnsi="Times New Roman" w:cs="Times New Roman"/>
-          <w:color w:val="000000" w:themeColor="text1"/>
-        </w:rPr>
-        <w:t xml:space="preserve"> fitment verification and user interaction testing. The control circuit board was designed and assembled to conform to the </w:t>
-      </w:r>
-      <w:proofErr w:type="gramStart"/>
-      <w:r>
-        <w:rPr>
-          <w:rFonts w:ascii="Times New Roman" w:eastAsia="Times New Roman" w:hAnsi="Times New Roman" w:cs="Times New Roman"/>
-          <w:color w:val="000000" w:themeColor="text1"/>
-        </w:rPr>
-        <w:t>allocated  dashboard</w:t>
-      </w:r>
-      <w:proofErr w:type="gramEnd"/>
-      <w:r>
-        <w:rPr>
-          <w:rFonts w:ascii="Times New Roman" w:eastAsia="Times New Roman" w:hAnsi="Times New Roman" w:cs="Times New Roman"/>
-          <w:color w:val="000000" w:themeColor="text1"/>
-        </w:rPr>
-        <w:t xml:space="preserve"> </w:t>
-      </w:r>
-      <w:proofErr w:type="gramStart"/>
-      <w:r>
-        <w:rPr>
-          <w:rFonts w:ascii="Times New Roman" w:eastAsia="Times New Roman" w:hAnsi="Times New Roman" w:cs="Times New Roman"/>
-          <w:color w:val="000000" w:themeColor="text1"/>
-        </w:rPr>
-        <w:t>of  2.75</w:t>
-      </w:r>
-      <w:proofErr w:type="gramEnd"/>
-      <w:r>
-        <w:rPr>
-          <w:rFonts w:ascii="Times New Roman" w:eastAsia="Times New Roman" w:hAnsi="Times New Roman" w:cs="Times New Roman"/>
-          <w:color w:val="000000" w:themeColor="text1"/>
-        </w:rPr>
-        <w:t xml:space="preserve"> in x 3.125 in. </w:t>
-      </w:r>
-      <w:proofErr w:type="gramStart"/>
-      <w:r>
-        <w:rPr>
-          <w:rFonts w:ascii="Times New Roman" w:eastAsia="Times New Roman" w:hAnsi="Times New Roman" w:cs="Times New Roman"/>
-          <w:color w:val="000000" w:themeColor="text1"/>
-        </w:rPr>
-        <w:t>prior</w:t>
-      </w:r>
-      <w:proofErr w:type="gramEnd"/>
-      <w:r>
-        <w:rPr>
-          <w:rFonts w:ascii="Times New Roman" w:eastAsia="Times New Roman" w:hAnsi="Times New Roman" w:cs="Times New Roman"/>
-          <w:color w:val="000000" w:themeColor="text1"/>
-        </w:rPr>
-        <w:t xml:space="preserve"> to permeant installation, the </w:t>
-      </w:r>
-      <w:r>
-        <w:rPr>
-          <w:rFonts w:ascii="Times New Roman" w:eastAsia="Times New Roman" w:hAnsi="Times New Roman" w:cs="Times New Roman"/>
-          <w:color w:val="000000" w:themeColor="text1"/>
-        </w:rPr>
-        <w:lastRenderedPageBreak/>
-        <w:t xml:space="preserve">joystick components were temporally secured in the location using tape to allow visual and dimensional comparison with </w:t>
-      </w:r>
-      <w:proofErr w:type="spellStart"/>
-      <w:proofErr w:type="gramStart"/>
-      <w:r>
-        <w:rPr>
-          <w:rFonts w:ascii="Times New Roman" w:eastAsia="Times New Roman" w:hAnsi="Times New Roman" w:cs="Times New Roman"/>
-          <w:color w:val="000000" w:themeColor="text1"/>
-        </w:rPr>
-        <w:t>he</w:t>
-      </w:r>
-      <w:proofErr w:type="spellEnd"/>
-      <w:proofErr w:type="gramEnd"/>
-      <w:r>
-        <w:rPr>
-          <w:rFonts w:ascii="Times New Roman" w:eastAsia="Times New Roman" w:hAnsi="Times New Roman" w:cs="Times New Roman"/>
-          <w:color w:val="000000" w:themeColor="text1"/>
-        </w:rPr>
-        <w:t xml:space="preserve"> available space. Once loosely secured, the vehicle was operated in a simulated use scenario. Testers interacted with the ride on car as a child user would, ensuring that the joystick and associated components did not obstruct operation, restrict movement, or practical useability of the installed parts.</w:t>
+        <w:t>Size evaluation was conducted through a physical fitment verification and user interaction testing. The control circuit board was designed and assembled to conform to the allocated  dashboard of  2.75 in x 3.125 in. prior to permeant installation, the joystick components were temporally secured in the location using tape to allow visual and dimensional comparison with he available space. Once loosely secured, the vehicle was operated in a simulated use scenario. Testers interacted with the ride on car as a child user would, ensuring that the joystick and associated components did not obstruct operation, restrict movement, or practical useability of the installed parts.</w:t>
       </w:r>
     </w:p>
     <w:p>
@@ -5128,23 +4380,7 @@
           <w:rFonts w:ascii="Times New Roman" w:eastAsia="Times New Roman" w:hAnsi="Times New Roman" w:cs="Times New Roman"/>
           <w:color w:val="000000" w:themeColor="text1"/>
         </w:rPr>
-        <w:t xml:space="preserve">During size evaluation, the joystick mount component required four design iterations due to improper fit within the allocated dashboard space. Each reprint addressed dimensional and alignment issues until the final </w:t>
-      </w:r>
-      <w:proofErr w:type="gramStart"/>
-      <w:r>
-        <w:rPr>
-          <w:rFonts w:ascii="Times New Roman" w:eastAsia="Times New Roman" w:hAnsi="Times New Roman" w:cs="Times New Roman"/>
-          <w:color w:val="000000" w:themeColor="text1"/>
-        </w:rPr>
-        <w:t>mount</w:t>
-      </w:r>
-      <w:proofErr w:type="gramEnd"/>
-      <w:r>
-        <w:rPr>
-          <w:rFonts w:ascii="Times New Roman" w:eastAsia="Times New Roman" w:hAnsi="Times New Roman" w:cs="Times New Roman"/>
-          <w:color w:val="000000" w:themeColor="text1"/>
-        </w:rPr>
-        <w:t xml:space="preserve"> achieved a secure and accurate fit. The circuit board and associated wiring were successfully integrated within the design rea and remained neatly secured </w:t>
+        <w:t xml:space="preserve">During size evaluation, the joystick mount component required four design iterations due to improper fit within the allocated dashboard space. Each reprint addressed dimensional and alignment issues until the final mount achieved a secure and accurate fit. The circuit board and associated wiring were successfully integrated within the design rea and remained neatly secured </w:t>
       </w:r>
       <w:r>
         <w:rPr>
@@ -5253,47 +4489,7 @@
           <w:rFonts w:ascii="Times New Roman" w:eastAsia="Times New Roman" w:hAnsi="Times New Roman" w:cs="Times New Roman"/>
           <w:color w:val="000000" w:themeColor="text1"/>
         </w:rPr>
-        <w:t xml:space="preserve">The electric ride on car joystick integration designed by the Snow Munchers team </w:t>
-      </w:r>
-      <w:proofErr w:type="gramStart"/>
-      <w:r>
-        <w:rPr>
-          <w:rFonts w:ascii="Times New Roman" w:eastAsia="Times New Roman" w:hAnsi="Times New Roman" w:cs="Times New Roman"/>
-          <w:color w:val="000000" w:themeColor="text1"/>
-        </w:rPr>
-        <w:t>wad</w:t>
-      </w:r>
-      <w:proofErr w:type="gramEnd"/>
-      <w:r>
-        <w:rPr>
-          <w:rFonts w:ascii="Times New Roman" w:eastAsia="Times New Roman" w:hAnsi="Times New Roman" w:cs="Times New Roman"/>
-          <w:color w:val="000000" w:themeColor="text1"/>
-        </w:rPr>
-        <w:t xml:space="preserve"> successfully evaluated against the defined design requirement using a combination of user testing, qualitative observation, and targeted system checks. The vehicle demonstrated reliable directional control and acceptable steering consistency under controlled testing conditions. Supporting predictable and safe maneuverability. Electric testing confirmed operation within the specified power limits, ensuring system safety and component reliability. Thermal performance did not present observable issues during extended operation, indicating the heat generation remains within acceptable bounds for the intended use. Additionally, the control components were successfully integrated within the allocated size constraints, preventing interference with drivability and reducing the risk of damage during regular use. Indicating the final design meets the primary functional, </w:t>
-      </w:r>
-      <w:r>
-        <w:rPr>
-          <w:rFonts w:ascii="Times New Roman" w:eastAsia="Times New Roman" w:hAnsi="Times New Roman" w:cs="Times New Roman"/>
-          <w:color w:val="000000" w:themeColor="text1"/>
-        </w:rPr>
-        <w:lastRenderedPageBreak/>
-        <w:t xml:space="preserve">safety, and usability criteria created for the </w:t>
-      </w:r>
-      <w:proofErr w:type="gramStart"/>
-      <w:r>
-        <w:rPr>
-          <w:rFonts w:ascii="Times New Roman" w:eastAsia="Times New Roman" w:hAnsi="Times New Roman" w:cs="Times New Roman"/>
-          <w:color w:val="000000" w:themeColor="text1"/>
-        </w:rPr>
-        <w:t>projects</w:t>
-      </w:r>
-      <w:proofErr w:type="gramEnd"/>
-      <w:r>
-        <w:rPr>
-          <w:rFonts w:ascii="Times New Roman" w:eastAsia="Times New Roman" w:hAnsi="Times New Roman" w:cs="Times New Roman"/>
-          <w:color w:val="000000" w:themeColor="text1"/>
-        </w:rPr>
-        <w:t xml:space="preserve"> solid foundation and future refinement.</w:t>
+        <w:t>The electric ride on car joystick integration designed by the Snow Munchers team wad successfully evaluated against the defined design requirement using a combination of user testing, qualitative observation, and targeted system checks. The vehicle demonstrated reliable directional control and acceptable steering consistency under controlled testing conditions. Supporting predictable and safe maneuverability. Electric testing confirmed operation within the specified power limits, ensuring system safety and component reliability. Thermal performance did not present observable issues during extended operation, indicating the heat generation remains within acceptable bounds for the intended use. Additionally, the control components were successfully integrated within the allocated size constraints, preventing interference with drivability and reducing the risk of damage during regular use. Indicating the final design meets the primary functional, safety, and usability criteria created for the projects solid foundation and future refinement.</w:t>
       </w:r>
     </w:p>
     <w:p>
@@ -5465,35 +4661,7 @@
         <w:rPr>
           <w:color w:val="000000" w:themeColor="text1"/>
         </w:rPr>
-        <w:t xml:space="preserve">rogression through the project had shifted the team dynamic to a "divide and conquer” approach. The members who could easily access the project consistently helped utilize their time by meeting with outside resources or by physically working on the project. The remaining members were tasked with taking </w:t>
-      </w:r>
-      <w:proofErr w:type="gramStart"/>
-      <w:r>
-        <w:rPr>
-          <w:color w:val="000000" w:themeColor="text1"/>
-        </w:rPr>
-        <w:t>record</w:t>
-      </w:r>
-      <w:proofErr w:type="gramEnd"/>
-      <w:r>
-        <w:rPr>
-          <w:color w:val="000000" w:themeColor="text1"/>
-        </w:rPr>
-        <w:t xml:space="preserve"> of progress, maintaining </w:t>
-      </w:r>
-      <w:proofErr w:type="gramStart"/>
-      <w:r>
-        <w:rPr>
-          <w:color w:val="000000" w:themeColor="text1"/>
-        </w:rPr>
-        <w:t>schedule</w:t>
-      </w:r>
-      <w:proofErr w:type="gramEnd"/>
-      <w:r>
-        <w:rPr>
-          <w:color w:val="000000" w:themeColor="text1"/>
-        </w:rPr>
-        <w:t xml:space="preserve">, and researching necessary data. While the workload may not have been split evenly, it was still divided fairly amongst all the members. When in doubt, check the Gantt chart. </w:t>
+        <w:t xml:space="preserve">rogression through the project had shifted the team dynamic to a "divide and conquer” approach. The members who could easily access the project consistently helped utilize their time by meeting with outside resources or by physically working on the project. The remaining members were tasked with taking record of progress, maintaining schedule, and researching necessary data. While the workload may not have been split evenly, it was still divided fairly amongst all the members. When in doubt, check the Gantt chart. </w:t>
       </w:r>
       <w:r>
         <w:rPr>
@@ -5505,21 +4673,7 @@
         <w:rPr>
           <w:color w:val="000000" w:themeColor="text1"/>
         </w:rPr>
-        <w:t xml:space="preserve">This tool helped </w:t>
-      </w:r>
-      <w:proofErr w:type="gramStart"/>
-      <w:r>
-        <w:rPr>
-          <w:color w:val="000000" w:themeColor="text1"/>
-        </w:rPr>
-        <w:t>the</w:t>
-      </w:r>
-      <w:proofErr w:type="gramEnd"/>
-      <w:r>
-        <w:rPr>
-          <w:color w:val="000000" w:themeColor="text1"/>
-        </w:rPr>
-        <w:t xml:space="preserve"> find common ground when progression was behind </w:t>
+        <w:t xml:space="preserve">This tool helped the find common ground when progression was behind </w:t>
       </w:r>
       <w:r>
         <w:rPr>
@@ -5737,21 +4891,7 @@
         <w:rPr>
           <w:color w:val="000000" w:themeColor="text1"/>
         </w:rPr>
-        <w:t xml:space="preserve"> designing and manufacturing </w:t>
-      </w:r>
-      <w:proofErr w:type="spellStart"/>
-      <w:r>
-        <w:rPr>
-          <w:color w:val="000000" w:themeColor="text1"/>
-        </w:rPr>
-        <w:t>a mount</w:t>
-      </w:r>
-      <w:proofErr w:type="spellEnd"/>
-      <w:r>
-        <w:rPr>
-          <w:color w:val="000000" w:themeColor="text1"/>
-        </w:rPr>
-        <w:t xml:space="preserve"> for the joystick</w:t>
+        <w:t xml:space="preserve"> designing and manufacturing a mount for the joystick</w:t>
       </w:r>
       <w:r>
         <w:rPr>
@@ -5827,7 +4967,6 @@
         <w:rPr>
           <w:color w:val="000000" w:themeColor="text1"/>
         </w:rPr>
-        <w:lastRenderedPageBreak/>
         <w:t>For general use, it is recommended that</w:t>
       </w:r>
       <w:r>
@@ -6095,23 +5234,7 @@
         <w:spacing w:before="240" w:after="240"/>
       </w:pPr>
       <w:r>
-        <w:t xml:space="preserve">[3] </w:t>
-      </w:r>
-      <w:proofErr w:type="spellStart"/>
-      <w:r>
-        <w:t>Instructables</w:t>
-      </w:r>
-      <w:proofErr w:type="spellEnd"/>
-      <w:r>
-        <w:t>, “</w:t>
-      </w:r>
-      <w:proofErr w:type="spellStart"/>
-      <w:r>
-        <w:t>GoBabyGo</w:t>
-      </w:r>
-      <w:proofErr w:type="spellEnd"/>
-      <w:r>
-        <w:t>: Make a Joystick</w:t>
+        <w:t>[3] Instructables, “GoBabyGo: Make a Joystick</w:t>
       </w:r>
       <w:r>
         <w:noBreakHyphen/>
@@ -6125,7 +5248,6 @@
       <w:r>
         <w:t xml:space="preserve">On Car,” </w:t>
       </w:r>
-      <w:proofErr w:type="spellStart"/>
       <w:r>
         <w:rPr>
           <w:i/>
@@ -6133,7 +5255,6 @@
         </w:rPr>
         <w:t>Instructables</w:t>
       </w:r>
-      <w:proofErr w:type="spellEnd"/>
       <w:r>
         <w:t xml:space="preserve">. Accessed: Apr. 29, 2026. [Online]. Available: </w:t>
       </w:r>
@@ -6345,7 +5466,6 @@
     </w:p>
     <w:p>
       <w:r>
-        <w:lastRenderedPageBreak/>
         <w:br w:type="page"/>
       </w:r>
     </w:p>
@@ -6420,21 +5540,7 @@
         <w:rPr>
           <w:color w:val="000000" w:themeColor="text1"/>
         </w:rPr>
-        <w:t xml:space="preserve">hild using” </w:t>
-      </w:r>
-      <w:proofErr w:type="spellStart"/>
-      <w:r>
-        <w:rPr>
-          <w:color w:val="000000" w:themeColor="text1"/>
-        </w:rPr>
-        <w:t>GoBabyGo</w:t>
-      </w:r>
-      <w:proofErr w:type="spellEnd"/>
-      <w:r>
-        <w:rPr>
-          <w:color w:val="000000" w:themeColor="text1"/>
-        </w:rPr>
-        <w:t xml:space="preserve">!” car where there is a button on the steering </w:t>
+        <w:t xml:space="preserve">hild using” GoBabyGo!” car where there is a button on the steering </w:t>
       </w:r>
       <w:r>
         <w:rPr>
@@ -6751,7 +5857,6 @@
           <w:bCs/>
           <w:color w:val="000000" w:themeColor="text1"/>
         </w:rPr>
-        <w:lastRenderedPageBreak/>
         <w:t>APPENDIX D</w:t>
       </w:r>
       <w:bookmarkEnd w:id="5"/>
@@ -7015,7 +6120,6 @@
         <w:rPr>
           <w:noProof/>
         </w:rPr>
-        <w:lastRenderedPageBreak/>
         <w:drawing>
           <wp:inline distT="0" distB="0" distL="0" distR="0" wp14:anchorId="5D74A1E7" wp14:editId="472AA961">
             <wp:extent cx="4514850" cy="2495550"/>
@@ -7324,7 +6428,6 @@
         <w:rPr>
           <w:noProof/>
         </w:rPr>
-        <w:lastRenderedPageBreak/>
         <w:drawing>
           <wp:inline distT="0" distB="0" distL="0" distR="0" wp14:anchorId="706AB4A8" wp14:editId="3E2B6F23">
             <wp:extent cx="2190750" cy="1238250"/>

</xml_diff>